<commit_message>
Update documentation with live Render application URLs
</commit_message>
<xml_diff>
--- a/docs/Apex_Portal_Documentation.docx
+++ b/docs/Apex_Portal_Documentation.docx
@@ -56,7 +56,7 @@
       </w:r>
     </w:p>
     <w:bookmarkEnd w:id="20"/>
-    <w:bookmarkStart w:id="31" w:name="Xbe55e0a4041a92fc5c21cfe8d2b12f027ff0dbe"/>
+    <w:bookmarkStart w:id="33" w:name="Xbe55e0a4041a92fc5c21cfe8d2b12f027ff0dbe"/>
     <w:p>
       <w:pPr>
         <w:pStyle w:val="Heading1"/>
@@ -65,7 +65,7 @@
         <w:t xml:space="preserve">SECTION 1: REPOSITORY README (PORTFOLIO OVERVIEW)</w:t>
       </w:r>
     </w:p>
-    <w:bookmarkStart w:id="30" w:name="X1f9b86686be526c7bc3f41d59f76c2d5e2c68b0"/>
+    <w:bookmarkStart w:id="32" w:name="X1f9b86686be526c7bc3f41d59f76c2d5e2c68b0"/>
     <w:p>
       <w:pPr>
         <w:pStyle w:val="Heading2"/>
@@ -79,10 +79,60 @@
         <w:pStyle w:val="FirstParagraph"/>
       </w:pPr>
       <w:r>
+        <w:rPr>
+          <w:bCs/>
+          <w:b/>
+        </w:rPr>
+        <w:t xml:space="preserve">Live Application Link</w:t>
+      </w:r>
+      <w:r>
+        <w:t xml:space="preserve">:</w:t>
+      </w:r>
+      <w:r>
+        <w:t xml:space="preserve"> </w:t>
+      </w:r>
+      <w:hyperlink r:id="rId21">
+        <w:r>
+          <w:rPr>
+            <w:rStyle w:val="Hyperlink"/>
+          </w:rPr>
+          <w:t xml:space="preserve">https://apex-portal-hq8m.onrender.com</w:t>
+        </w:r>
+      </w:hyperlink>
+      <w:r>
+        <w:t xml:space="preserve"> </w:t>
+      </w:r>
+      <w:r>
+        <w:rPr>
+          <w:bCs/>
+          <w:b/>
+        </w:rPr>
+        <w:t xml:space="preserve">GitHub Code Link</w:t>
+      </w:r>
+      <w:r>
+        <w:t xml:space="preserve">:</w:t>
+      </w:r>
+      <w:r>
+        <w:t xml:space="preserve"> </w:t>
+      </w:r>
+      <w:hyperlink r:id="rId22">
+        <w:r>
+          <w:rPr>
+            <w:rStyle w:val="Hyperlink"/>
+          </w:rPr>
+          <w:t xml:space="preserve">https://github.com/chirlebubblz/apex-portal</w:t>
+        </w:r>
+      </w:hyperlink>
+    </w:p>
+    <w:p>
+      <w:pPr>
+        <w:pStyle w:val="BodyText"/>
+      </w:pPr>
+      <w:r>
         <w:t xml:space="preserve">An enterprise-grade, mobile-installable (PWA) sandbox application designed to orchestrate the end-to-end sales, e-signature, inventory management, and shipping logistics lifecycle for solar installation operations.</w:t>
       </w:r>
     </w:p>
-    <w:bookmarkStart w:id="21" w:name="key-highlights-tech-stack"/>
+    <w:bookmarkStart w:id="23" w:name="key-highlights-tech-stack"/>
     <w:p>
       <w:pPr>
         <w:pStyle w:val="Heading3"/>
@@ -239,8 +289,8 @@
         </w:pict>
       </w:r>
     </w:p>
-    <w:bookmarkEnd w:id="21"/>
-    <w:bookmarkStart w:id="25" w:name="database-schema-details"/>
+    <w:bookmarkEnd w:id="23"/>
+    <w:bookmarkStart w:id="27" w:name="database-schema-details"/>
     <w:p>
       <w:pPr>
         <w:pStyle w:val="Heading3"/>
@@ -257,7 +307,7 @@
         <w:t xml:space="preserve">The database consists of three core tables (schema scripts located in /supabase/migrations):</w:t>
       </w:r>
     </w:p>
-    <w:bookmarkStart w:id="22" w:name="leads-table-leads"/>
+    <w:bookmarkStart w:id="24" w:name="leads-table-leads"/>
     <w:p>
       <w:pPr>
         <w:pStyle w:val="Heading4"/>
@@ -426,8 +476,8 @@
         <w:t xml:space="preserve">: JSONB (Stores campaign info, custom variables, and e-signatures)</w:t>
       </w:r>
     </w:p>
-    <w:bookmarkEnd w:id="22"/>
-    <w:bookmarkStart w:id="23" w:name="inventory-table-inventory"/>
+    <w:bookmarkEnd w:id="24"/>
+    <w:bookmarkStart w:id="25" w:name="inventory-table-inventory"/>
     <w:p>
       <w:pPr>
         <w:pStyle w:val="Heading4"/>
@@ -641,8 +691,8 @@
         <w:t xml:space="preserve">)</w:t>
       </w:r>
     </w:p>
-    <w:bookmarkEnd w:id="23"/>
-    <w:bookmarkStart w:id="24" w:name="log-table-pipeline_logs"/>
+    <w:bookmarkEnd w:id="25"/>
+    <w:bookmarkStart w:id="26" w:name="log-table-pipeline_logs"/>
     <w:p>
       <w:pPr>
         <w:pStyle w:val="Heading4"/>
@@ -761,9 +811,9 @@
         </w:pict>
       </w:r>
     </w:p>
-    <w:bookmarkEnd w:id="24"/>
-    <w:bookmarkEnd w:id="25"/>
-    <w:bookmarkStart w:id="26" w:name="setup-local-installation"/>
+    <w:bookmarkEnd w:id="26"/>
+    <w:bookmarkEnd w:id="27"/>
+    <w:bookmarkStart w:id="28" w:name="setup-local-installation"/>
     <w:p>
       <w:pPr>
         <w:pStyle w:val="Heading3"/>
@@ -945,8 +995,8 @@
         </w:pict>
       </w:r>
     </w:p>
-    <w:bookmarkEnd w:id="26"/>
-    <w:bookmarkStart w:id="29" w:name="cloud-deployment-configuration"/>
+    <w:bookmarkEnd w:id="28"/>
+    <w:bookmarkStart w:id="31" w:name="cloud-deployment-configuration"/>
     <w:p>
       <w:pPr>
         <w:pStyle w:val="Heading3"/>
@@ -955,7 +1005,7 @@
         <w:t xml:space="preserve">Cloud Deployment Configuration</w:t>
       </w:r>
     </w:p>
-    <w:bookmarkStart w:id="27" w:name="render-web-service"/>
+    <w:bookmarkStart w:id="29" w:name="render-web-service"/>
     <w:p>
       <w:pPr>
         <w:pStyle w:val="Heading4"/>
@@ -1028,8 +1078,8 @@
         <w:t xml:space="preserve">node dist/src/server.js</w:t>
       </w:r>
     </w:p>
-    <w:bookmarkEnd w:id="27"/>
-    <w:bookmarkStart w:id="28" w:name="supabase-live-database"/>
+    <w:bookmarkEnd w:id="29"/>
+    <w:bookmarkStart w:id="30" w:name="supabase-live-database"/>
     <w:p>
       <w:pPr>
         <w:pStyle w:val="Heading4"/>
@@ -1118,11 +1168,11 @@
         <w:t xml:space="preserve">false</w:t>
       </w:r>
     </w:p>
-    <w:bookmarkEnd w:id="28"/>
-    <w:bookmarkEnd w:id="29"/>
     <w:bookmarkEnd w:id="30"/>
     <w:bookmarkEnd w:id="31"/>
-    <w:bookmarkStart w:id="45" w:name="Xcf959d0487a91c33846acfe414b22179b6c8f5a"/>
+    <w:bookmarkEnd w:id="32"/>
+    <w:bookmarkEnd w:id="33"/>
+    <w:bookmarkStart w:id="47" w:name="Xcf959d0487a91c33846acfe414b22179b6c8f5a"/>
     <w:p>
       <w:pPr>
         <w:pStyle w:val="Heading1"/>
@@ -1131,7 +1181,7 @@
         <w:t xml:space="preserve">SECTION 2: STANDARD OPERATING PROCEDURE (SOP)</w:t>
       </w:r>
     </w:p>
-    <w:bookmarkStart w:id="44" w:name="X8a8b6ccdbba445b3cbbc2c38aa29e1e015ee931"/>
+    <w:bookmarkStart w:id="46" w:name="X8a8b6ccdbba445b3cbbc2c38aa29e1e015ee931"/>
     <w:p>
       <w:pPr>
         <w:pStyle w:val="Heading2"/>
@@ -1149,13 +1199,39 @@
           <w:bCs/>
           <w:b/>
         </w:rPr>
+        <w:t xml:space="preserve">Live Application Link</w:t>
+      </w:r>
+      <w:r>
+        <w:t xml:space="preserve">:</w:t>
+      </w:r>
+      <w:r>
+        <w:t xml:space="preserve"> </w:t>
+      </w:r>
+      <w:hyperlink r:id="rId21">
+        <w:r>
+          <w:rPr>
+            <w:rStyle w:val="Hyperlink"/>
+          </w:rPr>
+          <w:t xml:space="preserve">https://apex-portal-hq8m.onrender.com</w:t>
+        </w:r>
+      </w:hyperlink>
+    </w:p>
+    <w:p>
+      <w:pPr>
+        <w:pStyle w:val="BodyText"/>
+      </w:pPr>
+      <w:r>
+        <w:rPr>
+          <w:bCs/>
+          <w:b/>
+        </w:rPr>
         <w:t xml:space="preserve">Operational Note</w:t>
       </w:r>
       <w:r>
         <w:t xml:space="preserve">: This application is a fully functional end-to-end sandbox prototype. External automation engines (n8n) and messaging gateways (Twilio) are simulated within the dashboard to demonstrate the integration architecture without requiring paid API accounts.</w:t>
       </w:r>
     </w:p>
-    <w:bookmarkStart w:id="32" w:name="executive-summary-purpose"/>
+    <w:bookmarkStart w:id="34" w:name="executive-summary-purpose"/>
     <w:p>
       <w:pPr>
         <w:pStyle w:val="Heading3"/>
@@ -1172,8 +1248,8 @@
         <w:t xml:space="preserve">This document outlines the standard operational workflows for managing solar customer leads from initial contact to solar installation. The Apex Portal serves as the central control plane connecting sales operations, engineering surveys, customer communication, and equipment supply chains.</w:t>
       </w:r>
     </w:p>
-    <w:bookmarkEnd w:id="32"/>
-    <w:bookmarkStart w:id="34" w:name="lead-ingestion-qualification"/>
+    <w:bookmarkEnd w:id="34"/>
+    <w:bookmarkStart w:id="36" w:name="lead-ingestion-qualification"/>
     <w:p>
       <w:pPr>
         <w:pStyle w:val="Heading3"/>
@@ -1258,7 +1334,7 @@
         <w:t xml:space="preserve">modal.</w:t>
       </w:r>
     </w:p>
-    <w:bookmarkStart w:id="33" w:name="ingestion-requirements"/>
+    <w:bookmarkStart w:id="35" w:name="ingestion-requirements"/>
     <w:p>
       <w:pPr>
         <w:pStyle w:val="Heading4"/>
@@ -1343,9 +1419,9 @@
         <w:t xml:space="preserve">: Used by the proposal engine to calculate solar offset sizing.</w:t>
       </w:r>
     </w:p>
-    <w:bookmarkEnd w:id="33"/>
-    <w:bookmarkEnd w:id="34"/>
-    <w:bookmarkStart w:id="35" w:name="crm-pipeline-stage-management"/>
+    <w:bookmarkEnd w:id="35"/>
+    <w:bookmarkEnd w:id="36"/>
+    <w:bookmarkStart w:id="37" w:name="crm-pipeline-stage-management"/>
     <w:p>
       <w:pPr>
         <w:pStyle w:val="Heading3"/>
@@ -1627,8 +1703,8 @@
         </w:tc>
       </w:tr>
     </w:tbl>
-    <w:bookmarkEnd w:id="35"/>
-    <w:bookmarkStart w:id="37" w:name="interactive-proposal-digital-e-signature"/>
+    <w:bookmarkEnd w:id="37"/>
+    <w:bookmarkStart w:id="39" w:name="interactive-proposal-digital-e-signature"/>
     <w:p>
       <w:pPr>
         <w:pStyle w:val="Heading3"/>
@@ -1645,7 +1721,7 @@
         <w:t xml:space="preserve">Once site surveys are completed, the sales representative generates a customized solar system agreement.</w:t>
       </w:r>
     </w:p>
-    <w:bookmarkStart w:id="36" w:name="Xe4274b58530aadc822cbd1769e5140638ee1b11"/>
+    <w:bookmarkStart w:id="38" w:name="Xe4274b58530aadc822cbd1769e5140638ee1b11"/>
     <w:p>
       <w:pPr>
         <w:pStyle w:val="Heading4"/>
@@ -1820,9 +1896,9 @@
         <w:t xml:space="preserve">: Reopening the proposal draws the saved signature back onto the pad from database records.</w:t>
       </w:r>
     </w:p>
-    <w:bookmarkEnd w:id="36"/>
-    <w:bookmarkEnd w:id="37"/>
-    <w:bookmarkStart w:id="40" w:name="inventory-allocation-shipping-logistics"/>
+    <w:bookmarkEnd w:id="38"/>
+    <w:bookmarkEnd w:id="39"/>
+    <w:bookmarkStart w:id="42" w:name="inventory-allocation-shipping-logistics"/>
     <w:p>
       <w:pPr>
         <w:pStyle w:val="Heading3"/>
@@ -1851,7 +1927,7 @@
         <w:t xml:space="preserve">, operators allocate hardware components to the installation.</w:t>
       </w:r>
     </w:p>
-    <w:bookmarkStart w:id="38" w:name="workflow-for-supply-chain-dispatch"/>
+    <w:bookmarkStart w:id="40" w:name="workflow-for-supply-chain-dispatch"/>
     <w:p>
       <w:pPr>
         <w:pStyle w:val="Heading4"/>
@@ -2045,8 +2121,8 @@
         <w:t xml:space="preserve">.</w:t>
       </w:r>
     </w:p>
-    <w:bookmarkEnd w:id="38"/>
-    <w:bookmarkStart w:id="39" w:name="shipment-status-lifecycle"/>
+    <w:bookmarkEnd w:id="40"/>
+    <w:bookmarkStart w:id="41" w:name="shipment-status-lifecycle"/>
     <w:p>
       <w:pPr>
         <w:pStyle w:val="Heading4"/>
@@ -2139,9 +2215,9 @@
         <w:t xml:space="preserve">: System commissioned on-site. Completion email sent to customer.</w:t>
       </w:r>
     </w:p>
-    <w:bookmarkEnd w:id="39"/>
-    <w:bookmarkEnd w:id="40"/>
-    <w:bookmarkStart w:id="43" w:name="integration-architecture-n8n-twilio"/>
+    <w:bookmarkEnd w:id="41"/>
+    <w:bookmarkEnd w:id="42"/>
+    <w:bookmarkStart w:id="45" w:name="integration-architecture-n8n-twilio"/>
     <w:p>
       <w:pPr>
         <w:pStyle w:val="Heading3"/>
@@ -2190,7 +2266,7 @@
         <w:t xml:space="preserve">to automate workflows:</w:t>
       </w:r>
     </w:p>
-    <w:bookmarkStart w:id="41" w:name="n8n-automation-hub"/>
+    <w:bookmarkStart w:id="43" w:name="n8n-automation-hub"/>
     <w:p>
       <w:pPr>
         <w:pStyle w:val="Heading4"/>
@@ -2420,8 +2496,8 @@
         <w:t xml:space="preserve">The engine will automatically transition from simulation mode to sending live HTTP posts to your active flow.</w:t>
       </w:r>
     </w:p>
-    <w:bookmarkEnd w:id="41"/>
-    <w:bookmarkStart w:id="42" w:name="twilio-sms-messaging-gateway"/>
+    <w:bookmarkEnd w:id="43"/>
+    <w:bookmarkStart w:id="44" w:name="twilio-sms-messaging-gateway"/>
     <w:p>
       <w:pPr>
         <w:pStyle w:val="Heading4"/>
@@ -2503,10 +2579,10 @@
         <w:t xml:space="preserve">panel, allowing users to verify messaging triggers and copy in-flight texts without configuring credentials.</w:t>
       </w:r>
     </w:p>
-    <w:bookmarkEnd w:id="42"/>
-    <w:bookmarkEnd w:id="43"/>
     <w:bookmarkEnd w:id="44"/>
     <w:bookmarkEnd w:id="45"/>
+    <w:bookmarkEnd w:id="46"/>
+    <w:bookmarkEnd w:id="47"/>
     <w:sectPr/>
   </w:body>
 </w:document>

</xml_diff>

<commit_message>
Update documentation with backend security measures (Rate Limiting, XSS protection, Token authorization)
</commit_message>
<xml_diff>
--- a/docs/Apex_Portal_Documentation.docx
+++ b/docs/Apex_Portal_Documentation.docx
@@ -283,6 +283,106 @@
       </w:r>
     </w:p>
     <w:p>
+      <w:pPr>
+        <w:numPr>
+          <w:ilvl w:val="0"/>
+          <w:numId w:val="1001"/>
+        </w:numPr>
+        <w:pStyle w:val="Compact"/>
+      </w:pPr>
+      <w:r>
+        <w:rPr>
+          <w:bCs/>
+          <w:b/>
+        </w:rPr>
+        <w:t xml:space="preserve">API Security Shields</w:t>
+      </w:r>
+      <w:r>
+        <w:t xml:space="preserve">: Built-in production-grade security:</w:t>
+      </w:r>
+    </w:p>
+    <w:p>
+      <w:pPr>
+        <w:numPr>
+          <w:ilvl w:val="1"/>
+          <w:numId w:val="1003"/>
+        </w:numPr>
+        <w:pStyle w:val="Compact"/>
+      </w:pPr>
+      <w:r>
+        <w:rPr>
+          <w:bCs/>
+          <w:b/>
+        </w:rPr>
+        <w:t xml:space="preserve">Rate Limiter</w:t>
+      </w:r>
+      <w:r>
+        <w:t xml:space="preserve">: Configures</w:t>
+      </w:r>
+      <w:r>
+        <w:t xml:space="preserve"> </w:t>
+      </w:r>
+      <w:r>
+        <w:rPr>
+          <w:rStyle w:val="VerbatimChar"/>
+        </w:rPr>
+        <w:t xml:space="preserve">express-rate-limit</w:t>
+      </w:r>
+      <w:r>
+        <w:t xml:space="preserve"> </w:t>
+      </w:r>
+      <w:r>
+        <w:t xml:space="preserve">on the public lead ingestion endpoint to prevent database spamming.</w:t>
+      </w:r>
+    </w:p>
+    <w:p>
+      <w:pPr>
+        <w:numPr>
+          <w:ilvl w:val="1"/>
+          <w:numId w:val="1003"/>
+        </w:numPr>
+        <w:pStyle w:val="Compact"/>
+      </w:pPr>
+      <w:r>
+        <w:rPr>
+          <w:bCs/>
+          <w:b/>
+        </w:rPr>
+        <w:t xml:space="preserve">XSS Sanitizer</w:t>
+      </w:r>
+      <w:r>
+        <w:t xml:space="preserve">: Global middleware to recursively strip HTML/Script tags from incoming request bodies.</w:t>
+      </w:r>
+    </w:p>
+    <w:p>
+      <w:pPr>
+        <w:numPr>
+          <w:ilvl w:val="1"/>
+          <w:numId w:val="1003"/>
+        </w:numPr>
+        <w:pStyle w:val="Compact"/>
+      </w:pPr>
+      <w:r>
+        <w:rPr>
+          <w:bCs/>
+          <w:b/>
+        </w:rPr>
+        <w:t xml:space="preserve">Authorization Middleware</w:t>
+      </w:r>
+      <w:r>
+        <w:t xml:space="preserve">: Optional environment-driven token validation (</w:t>
+      </w:r>
+      <w:r>
+        <w:rPr>
+          <w:rStyle w:val="VerbatimChar"/>
+        </w:rPr>
+        <w:t xml:space="preserve">API_SECRET_TOKEN</w:t>
+      </w:r>
+      <w:r>
+        <w:t xml:space="preserve">) to secure update and delete routes while keeping default sandbox mode open.</w:t>
+      </w:r>
+    </w:p>
+    <w:p>
       <w:r>
         <w:pict>
           <v:rect style="width:0;height:1.5pt" o:hralign="center" o:hrstd="t" o:hr="t"/>
@@ -834,7 +934,7 @@
       <w:pPr>
         <w:numPr>
           <w:ilvl w:val="0"/>
-          <w:numId w:val="1003"/>
+          <w:numId w:val="1004"/>
         </w:numPr>
         <w:pStyle w:val="Compact"/>
       </w:pPr>
@@ -871,7 +971,7 @@
       <w:pPr>
         <w:numPr>
           <w:ilvl w:val="0"/>
-          <w:numId w:val="1003"/>
+          <w:numId w:val="1004"/>
         </w:numPr>
         <w:pStyle w:val="Compact"/>
       </w:pPr>
@@ -899,7 +999,7 @@
       <w:pPr>
         <w:numPr>
           <w:ilvl w:val="0"/>
-          <w:numId w:val="1003"/>
+          <w:numId w:val="1004"/>
         </w:numPr>
         <w:pStyle w:val="Compact"/>
       </w:pPr>
@@ -927,7 +1027,7 @@
       <w:pPr>
         <w:numPr>
           <w:ilvl w:val="0"/>
-          <w:numId w:val="1003"/>
+          <w:numId w:val="1004"/>
         </w:numPr>
         <w:pStyle w:val="Compact"/>
       </w:pPr>
@@ -955,7 +1055,7 @@
       <w:pPr>
         <w:numPr>
           <w:ilvl w:val="0"/>
-          <w:numId w:val="1003"/>
+          <w:numId w:val="1004"/>
         </w:numPr>
         <w:pStyle w:val="Compact"/>
       </w:pPr>
@@ -1172,7 +1272,7 @@
     <w:bookmarkEnd w:id="31"/>
     <w:bookmarkEnd w:id="32"/>
     <w:bookmarkEnd w:id="33"/>
-    <w:bookmarkStart w:id="47" w:name="Xcf959d0487a91c33846acfe414b22179b6c8f5a"/>
+    <w:bookmarkStart w:id="51" w:name="Xcf959d0487a91c33846acfe414b22179b6c8f5a"/>
     <w:p>
       <w:pPr>
         <w:pStyle w:val="Heading1"/>
@@ -1181,7 +1281,7 @@
         <w:t xml:space="preserve">SECTION 2: STANDARD OPERATING PROCEDURE (SOP)</w:t>
       </w:r>
     </w:p>
-    <w:bookmarkStart w:id="46" w:name="X8a8b6ccdbba445b3cbbc2c38aa29e1e015ee931"/>
+    <w:bookmarkStart w:id="50" w:name="X8a8b6ccdbba445b3cbbc2c38aa29e1e015ee931"/>
     <w:p>
       <w:pPr>
         <w:pStyle w:val="Heading2"/>
@@ -1347,7 +1447,7 @@
       <w:pPr>
         <w:numPr>
           <w:ilvl w:val="0"/>
-          <w:numId w:val="1004"/>
+          <w:numId w:val="1005"/>
         </w:numPr>
         <w:pStyle w:val="Compact"/>
       </w:pPr>
@@ -1366,7 +1466,7 @@
       <w:pPr>
         <w:numPr>
           <w:ilvl w:val="0"/>
-          <w:numId w:val="1004"/>
+          <w:numId w:val="1005"/>
         </w:numPr>
         <w:pStyle w:val="Compact"/>
       </w:pPr>
@@ -1385,7 +1485,7 @@
       <w:pPr>
         <w:numPr>
           <w:ilvl w:val="0"/>
-          <w:numId w:val="1004"/>
+          <w:numId w:val="1005"/>
         </w:numPr>
         <w:pStyle w:val="Compact"/>
       </w:pPr>
@@ -1404,7 +1504,7 @@
       <w:pPr>
         <w:numPr>
           <w:ilvl w:val="0"/>
-          <w:numId w:val="1004"/>
+          <w:numId w:val="1005"/>
         </w:numPr>
         <w:pStyle w:val="Compact"/>
       </w:pPr>
@@ -1734,7 +1834,7 @@
       <w:pPr>
         <w:numPr>
           <w:ilvl w:val="0"/>
-          <w:numId w:val="1005"/>
+          <w:numId w:val="1006"/>
         </w:numPr>
         <w:pStyle w:val="Compact"/>
       </w:pPr>
@@ -1767,173 +1867,6 @@
       </w:r>
       <w:r>
         <w:t xml:space="preserve">.</w:t>
-      </w:r>
-    </w:p>
-    <w:p>
-      <w:pPr>
-        <w:numPr>
-          <w:ilvl w:val="0"/>
-          <w:numId w:val="1005"/>
-        </w:numPr>
-        <w:pStyle w:val="Compact"/>
-      </w:pPr>
-      <w:r>
-        <w:rPr>
-          <w:bCs/>
-          <w:b/>
-        </w:rPr>
-        <w:t xml:space="preserve">Review offset calculations</w:t>
-      </w:r>
-      <w:r>
-        <w:t xml:space="preserve">: System automatically scales solar panel capacity and battery needs based on the lead’s monthly bill.</w:t>
-      </w:r>
-    </w:p>
-    <w:p>
-      <w:pPr>
-        <w:numPr>
-          <w:ilvl w:val="0"/>
-          <w:numId w:val="1005"/>
-        </w:numPr>
-        <w:pStyle w:val="Compact"/>
-      </w:pPr>
-      <w:r>
-        <w:rPr>
-          <w:bCs/>
-          <w:b/>
-        </w:rPr>
-        <w:t xml:space="preserve">Capture Signature</w:t>
-      </w:r>
-      <w:r>
-        <w:t xml:space="preserve">: Have the client sign directly on the digital signature pad.</w:t>
-      </w:r>
-    </w:p>
-    <w:p>
-      <w:pPr>
-        <w:numPr>
-          <w:ilvl w:val="0"/>
-          <w:numId w:val="1005"/>
-        </w:numPr>
-        <w:pStyle w:val="Compact"/>
-      </w:pPr>
-      <w:r>
-        <w:rPr>
-          <w:bCs/>
-          <w:b/>
-        </w:rPr>
-        <w:t xml:space="preserve">Accept &amp; Save</w:t>
-      </w:r>
-      <w:r>
-        <w:t xml:space="preserve">: Clicking</w:t>
-      </w:r>
-      <w:r>
-        <w:t xml:space="preserve"> </w:t>
-      </w:r>
-      <w:r>
-        <w:rPr>
-          <w:bCs/>
-          <w:b/>
-        </w:rPr>
-        <w:t xml:space="preserve">“</w:t>
-      </w:r>
-      <w:r>
-        <w:rPr>
-          <w:bCs/>
-          <w:b/>
-        </w:rPr>
-        <w:t xml:space="preserve">Accept &amp; Sign Proposal</w:t>
-      </w:r>
-      <w:r>
-        <w:rPr>
-          <w:bCs/>
-          <w:b/>
-        </w:rPr>
-        <w:t xml:space="preserve">”</w:t>
-      </w:r>
-      <w:r>
-        <w:t xml:space="preserve"> </w:t>
-      </w:r>
-      <w:r>
-        <w:t xml:space="preserve">converts the canvas sketch to a Base64 image, updates the lead metadata (</w:t>
-      </w:r>
-      <w:r>
-        <w:rPr>
-          <w:rStyle w:val="VerbatimChar"/>
-        </w:rPr>
-        <w:t xml:space="preserve">metadata.signature</w:t>
-      </w:r>
-      <w:r>
-        <w:t xml:space="preserve">), transitions the stage to</w:t>
-      </w:r>
-      <w:r>
-        <w:t xml:space="preserve"> </w:t>
-      </w:r>
-      <w:r>
-        <w:rPr>
-          <w:rStyle w:val="VerbatimChar"/>
-        </w:rPr>
-        <w:t xml:space="preserve">Closed Won</w:t>
-      </w:r>
-      <w:r>
-        <w:t xml:space="preserve">, and closes the deal.</w:t>
-      </w:r>
-    </w:p>
-    <w:p>
-      <w:pPr>
-        <w:numPr>
-          <w:ilvl w:val="0"/>
-          <w:numId w:val="1005"/>
-        </w:numPr>
-        <w:pStyle w:val="Compact"/>
-      </w:pPr>
-      <w:r>
-        <w:rPr>
-          <w:bCs/>
-          <w:b/>
-        </w:rPr>
-        <w:t xml:space="preserve">Reopening</w:t>
-      </w:r>
-      <w:r>
-        <w:t xml:space="preserve">: Reopening the proposal draws the saved signature back onto the pad from database records.</w:t>
-      </w:r>
-    </w:p>
-    <w:bookmarkEnd w:id="38"/>
-    <w:bookmarkEnd w:id="39"/>
-    <w:bookmarkStart w:id="42" w:name="inventory-allocation-shipping-logistics"/>
-    <w:p>
-      <w:pPr>
-        <w:pStyle w:val="Heading3"/>
-      </w:pPr>
-      <w:r>
-        <w:t xml:space="preserve">5. Inventory Allocation &amp; Shipping Logistics</w:t>
-      </w:r>
-    </w:p>
-    <w:p>
-      <w:pPr>
-        <w:pStyle w:val="FirstParagraph"/>
-      </w:pPr>
-      <w:r>
-        <w:t xml:space="preserve">When a lead is marked</w:t>
-      </w:r>
-      <w:r>
-        <w:t xml:space="preserve"> </w:t>
-      </w:r>
-      <w:r>
-        <w:rPr>
-          <w:rStyle w:val="VerbatimChar"/>
-        </w:rPr>
-        <w:t xml:space="preserve">Closed Won</w:t>
-      </w:r>
-      <w:r>
-        <w:t xml:space="preserve">, operators allocate hardware components to the installation.</w:t>
-      </w:r>
-    </w:p>
-    <w:bookmarkStart w:id="40" w:name="workflow-for-supply-chain-dispatch"/>
-    <w:p>
-      <w:pPr>
-        <w:pStyle w:val="Heading4"/>
-      </w:pPr>
-      <w:r>
-        <w:t xml:space="preserve">Workflow for Supply Chain Dispatch:</w:t>
       </w:r>
     </w:p>
     <w:p>
@@ -1945,23 +1878,14 @@
         <w:pStyle w:val="Compact"/>
       </w:pPr>
       <w:r>
-        <w:t xml:space="preserve">Navigate to the</w:t>
-      </w:r>
-      <w:r>
-        <w:t xml:space="preserve"> </w:t>
-      </w:r>
-      <w:r>
-        <w:rPr>
-          <w:bCs/>
-          <w:b/>
-        </w:rPr>
-        <w:t xml:space="preserve">Inventory &amp; Logistics</w:t>
-      </w:r>
-      <w:r>
-        <w:t xml:space="preserve"> </w:t>
-      </w:r>
-      <w:r>
-        <w:t xml:space="preserve">tab.</w:t>
+        <w:rPr>
+          <w:bCs/>
+          <w:b/>
+        </w:rPr>
+        <w:t xml:space="preserve">Review offset calculations</w:t>
+      </w:r>
+      <w:r>
+        <w:t xml:space="preserve">: System automatically scales solar panel capacity and battery needs based on the lead’s monthly bill.</w:t>
       </w:r>
     </w:p>
     <w:p>
@@ -1973,37 +1897,14 @@
         <w:pStyle w:val="Compact"/>
       </w:pPr>
       <w:r>
-        <w:t xml:space="preserve">Select</w:t>
-      </w:r>
-      <w:r>
-        <w:t xml:space="preserve"> </w:t>
-      </w:r>
-      <w:r>
-        <w:rPr>
-          <w:bCs/>
-          <w:b/>
-        </w:rPr>
-        <w:t xml:space="preserve">“</w:t>
-      </w:r>
-      <w:r>
-        <w:rPr>
-          <w:bCs/>
-          <w:b/>
-        </w:rPr>
-        <w:t xml:space="preserve">Add Stock Item</w:t>
-      </w:r>
-      <w:r>
-        <w:rPr>
-          <w:bCs/>
-          <w:b/>
-        </w:rPr>
-        <w:t xml:space="preserve">”</w:t>
-      </w:r>
-      <w:r>
-        <w:t xml:space="preserve"> </w:t>
-      </w:r>
-      <w:r>
-        <w:t xml:space="preserve">to register raw inventory (e.g. Panels, Inverters, Batteries) or edit existing stock.</w:t>
+        <w:rPr>
+          <w:bCs/>
+          <w:b/>
+        </w:rPr>
+        <w:t xml:space="preserve">Capture Signature</w:t>
+      </w:r>
+      <w:r>
+        <w:t xml:space="preserve">: Have the client sign directly on the digital signature pad.</w:t>
       </w:r>
     </w:p>
     <w:p>
@@ -2015,23 +1916,65 @@
         <w:pStyle w:val="Compact"/>
       </w:pPr>
       <w:r>
-        <w:t xml:space="preserve">Under the</w:t>
-      </w:r>
-      <w:r>
-        <w:t xml:space="preserve"> </w:t>
-      </w:r>
-      <w:r>
-        <w:rPr>
-          <w:bCs/>
-          <w:b/>
-        </w:rPr>
-        <w:t xml:space="preserve">Logistics Shipments</w:t>
-      </w:r>
-      <w:r>
-        <w:t xml:space="preserve"> </w:t>
-      </w:r>
-      <w:r>
-        <w:t xml:space="preserve">panel, select a pending lead, select the required hardware components (SKU), and enter the partner warehouse country.</w:t>
+        <w:rPr>
+          <w:bCs/>
+          <w:b/>
+        </w:rPr>
+        <w:t xml:space="preserve">Accept &amp; Save</w:t>
+      </w:r>
+      <w:r>
+        <w:t xml:space="preserve">: Clicking</w:t>
+      </w:r>
+      <w:r>
+        <w:t xml:space="preserve"> </w:t>
+      </w:r>
+      <w:r>
+        <w:rPr>
+          <w:bCs/>
+          <w:b/>
+        </w:rPr>
+        <w:t xml:space="preserve">“</w:t>
+      </w:r>
+      <w:r>
+        <w:rPr>
+          <w:bCs/>
+          <w:b/>
+        </w:rPr>
+        <w:t xml:space="preserve">Accept &amp; Sign Proposal</w:t>
+      </w:r>
+      <w:r>
+        <w:rPr>
+          <w:bCs/>
+          <w:b/>
+        </w:rPr>
+        <w:t xml:space="preserve">”</w:t>
+      </w:r>
+      <w:r>
+        <w:t xml:space="preserve"> </w:t>
+      </w:r>
+      <w:r>
+        <w:t xml:space="preserve">converts the canvas sketch to a Base64 image, updates the lead metadata (</w:t>
+      </w:r>
+      <w:r>
+        <w:rPr>
+          <w:rStyle w:val="VerbatimChar"/>
+        </w:rPr>
+        <w:t xml:space="preserve">metadata.signature</w:t>
+      </w:r>
+      <w:r>
+        <w:t xml:space="preserve">), transitions the stage to</w:t>
+      </w:r>
+      <w:r>
+        <w:t xml:space="preserve"> </w:t>
+      </w:r>
+      <w:r>
+        <w:rPr>
+          <w:rStyle w:val="VerbatimChar"/>
+        </w:rPr>
+        <w:t xml:space="preserve">Closed Won</w:t>
+      </w:r>
+      <w:r>
+        <w:t xml:space="preserve">, and closes the deal.</w:t>
       </w:r>
     </w:p>
     <w:p>
@@ -2043,69 +1986,226 @@
         <w:pStyle w:val="Compact"/>
       </w:pPr>
       <w:r>
-        <w:t xml:space="preserve">Click</w:t>
-      </w:r>
-      <w:r>
-        <w:t xml:space="preserve"> </w:t>
-      </w:r>
-      <w:r>
-        <w:rPr>
-          <w:bCs/>
-          <w:b/>
-        </w:rPr>
-        <w:t xml:space="preserve">“</w:t>
-      </w:r>
-      <w:r>
-        <w:rPr>
-          <w:bCs/>
-          <w:b/>
-        </w:rPr>
-        <w:t xml:space="preserve">Request Dispatch</w:t>
-      </w:r>
-      <w:r>
-        <w:rPr>
-          <w:bCs/>
-          <w:b/>
-        </w:rPr>
-        <w:t xml:space="preserve">”</w:t>
-      </w:r>
-      <w:r>
-        <w:t xml:space="preserve">:</w:t>
+        <w:rPr>
+          <w:bCs/>
+          <w:b/>
+        </w:rPr>
+        <w:t xml:space="preserve">Reopening</w:t>
+      </w:r>
+      <w:r>
+        <w:t xml:space="preserve">: Reopening the proposal draws the saved signature back onto the pad from database records.</w:t>
+      </w:r>
+    </w:p>
+    <w:bookmarkEnd w:id="38"/>
+    <w:bookmarkEnd w:id="39"/>
+    <w:bookmarkStart w:id="42" w:name="inventory-allocation-shipping-logistics"/>
+    <w:p>
+      <w:pPr>
+        <w:pStyle w:val="Heading3"/>
+      </w:pPr>
+      <w:r>
+        <w:t xml:space="preserve">5. Inventory Allocation &amp; Shipping Logistics</w:t>
+      </w:r>
+    </w:p>
+    <w:p>
+      <w:pPr>
+        <w:pStyle w:val="FirstParagraph"/>
+      </w:pPr>
+      <w:r>
+        <w:t xml:space="preserve">When a lead is marked</w:t>
+      </w:r>
+      <w:r>
+        <w:t xml:space="preserve"> </w:t>
+      </w:r>
+      <w:r>
+        <w:rPr>
+          <w:rStyle w:val="VerbatimChar"/>
+        </w:rPr>
+        <w:t xml:space="preserve">Closed Won</w:t>
+      </w:r>
+      <w:r>
+        <w:t xml:space="preserve">, operators allocate hardware components to the installation.</w:t>
+      </w:r>
+    </w:p>
+    <w:bookmarkStart w:id="40" w:name="workflow-for-supply-chain-dispatch"/>
+    <w:p>
+      <w:pPr>
+        <w:pStyle w:val="Heading4"/>
+      </w:pPr>
+      <w:r>
+        <w:t xml:space="preserve">Workflow for Supply Chain Dispatch:</w:t>
       </w:r>
     </w:p>
     <w:p>
       <w:pPr>
         <w:numPr>
-          <w:ilvl w:val="1"/>
+          <w:ilvl w:val="0"/>
           <w:numId w:val="1007"/>
         </w:numPr>
         <w:pStyle w:val="Compact"/>
       </w:pPr>
       <w:r>
-        <w:t xml:space="preserve">The system checks local warehouse stock.</w:t>
+        <w:t xml:space="preserve">Navigate to the</w:t>
+      </w:r>
+      <w:r>
+        <w:t xml:space="preserve"> </w:t>
+      </w:r>
+      <w:r>
+        <w:rPr>
+          <w:bCs/>
+          <w:b/>
+        </w:rPr>
+        <w:t xml:space="preserve">Inventory &amp; Logistics</w:t>
+      </w:r>
+      <w:r>
+        <w:t xml:space="preserve"> </w:t>
+      </w:r>
+      <w:r>
+        <w:t xml:space="preserve">tab.</w:t>
       </w:r>
     </w:p>
     <w:p>
       <w:pPr>
         <w:numPr>
-          <w:ilvl w:val="1"/>
+          <w:ilvl w:val="0"/>
           <w:numId w:val="1007"/>
         </w:numPr>
         <w:pStyle w:val="Compact"/>
       </w:pPr>
       <w:r>
-        <w:t xml:space="preserve">If stock is available, it decreases the warehouse inventory level and creates a tracking shipment.</w:t>
+        <w:t xml:space="preserve">Select</w:t>
+      </w:r>
+      <w:r>
+        <w:t xml:space="preserve"> </w:t>
+      </w:r>
+      <w:r>
+        <w:rPr>
+          <w:bCs/>
+          <w:b/>
+        </w:rPr>
+        <w:t xml:space="preserve">“</w:t>
+      </w:r>
+      <w:r>
+        <w:rPr>
+          <w:bCs/>
+          <w:b/>
+        </w:rPr>
+        <w:t xml:space="preserve">Add Stock Item</w:t>
+      </w:r>
+      <w:r>
+        <w:rPr>
+          <w:bCs/>
+          <w:b/>
+        </w:rPr>
+        <w:t xml:space="preserve">”</w:t>
+      </w:r>
+      <w:r>
+        <w:t xml:space="preserve"> </w:t>
+      </w:r>
+      <w:r>
+        <w:t xml:space="preserve">to register raw inventory (e.g. Panels, Inverters, Batteries) or edit existing stock.</w:t>
       </w:r>
     </w:p>
     <w:p>
       <w:pPr>
         <w:numPr>
-          <w:ilvl w:val="1"/>
+          <w:ilvl w:val="0"/>
           <w:numId w:val="1007"/>
         </w:numPr>
         <w:pStyle w:val="Compact"/>
       </w:pPr>
       <w:r>
+        <w:t xml:space="preserve">Under the</w:t>
+      </w:r>
+      <w:r>
+        <w:t xml:space="preserve"> </w:t>
+      </w:r>
+      <w:r>
+        <w:rPr>
+          <w:bCs/>
+          <w:b/>
+        </w:rPr>
+        <w:t xml:space="preserve">Logistics Shipments</w:t>
+      </w:r>
+      <w:r>
+        <w:t xml:space="preserve"> </w:t>
+      </w:r>
+      <w:r>
+        <w:t xml:space="preserve">panel, select a pending lead, select the required hardware components (SKU), and enter the partner warehouse country.</w:t>
+      </w:r>
+    </w:p>
+    <w:p>
+      <w:pPr>
+        <w:numPr>
+          <w:ilvl w:val="0"/>
+          <w:numId w:val="1007"/>
+        </w:numPr>
+        <w:pStyle w:val="Compact"/>
+      </w:pPr>
+      <w:r>
+        <w:t xml:space="preserve">Click</w:t>
+      </w:r>
+      <w:r>
+        <w:t xml:space="preserve"> </w:t>
+      </w:r>
+      <w:r>
+        <w:rPr>
+          <w:bCs/>
+          <w:b/>
+        </w:rPr>
+        <w:t xml:space="preserve">“</w:t>
+      </w:r>
+      <w:r>
+        <w:rPr>
+          <w:bCs/>
+          <w:b/>
+        </w:rPr>
+        <w:t xml:space="preserve">Request Dispatch</w:t>
+      </w:r>
+      <w:r>
+        <w:rPr>
+          <w:bCs/>
+          <w:b/>
+        </w:rPr>
+        <w:t xml:space="preserve">”</w:t>
+      </w:r>
+      <w:r>
+        <w:t xml:space="preserve">:</w:t>
+      </w:r>
+    </w:p>
+    <w:p>
+      <w:pPr>
+        <w:numPr>
+          <w:ilvl w:val="1"/>
+          <w:numId w:val="1008"/>
+        </w:numPr>
+        <w:pStyle w:val="Compact"/>
+      </w:pPr>
+      <w:r>
+        <w:t xml:space="preserve">The system checks local warehouse stock.</w:t>
+      </w:r>
+    </w:p>
+    <w:p>
+      <w:pPr>
+        <w:numPr>
+          <w:ilvl w:val="1"/>
+          <w:numId w:val="1008"/>
+        </w:numPr>
+        <w:pStyle w:val="Compact"/>
+      </w:pPr>
+      <w:r>
+        <w:t xml:space="preserve">If stock is available, it decreases the warehouse inventory level and creates a tracking shipment.</w:t>
+      </w:r>
+    </w:p>
+    <w:p>
+      <w:pPr>
+        <w:numPr>
+          <w:ilvl w:val="1"/>
+          <w:numId w:val="1008"/>
+        </w:numPr>
+        <w:pStyle w:val="Compact"/>
+      </w:pPr>
+      <w:r>
         <w:t xml:space="preserve">A shipment order is generated with a status of</w:t>
       </w:r>
       <w:r>
@@ -2279,179 +2379,57 @@
       <w:pPr>
         <w:numPr>
           <w:ilvl w:val="0"/>
-          <w:numId w:val="1008"/>
-        </w:numPr>
-        <w:pStyle w:val="Compact"/>
-      </w:pPr>
-      <w:r>
-        <w:rPr>
-          <w:bCs/>
-          <w:b/>
-        </w:rPr>
-        <w:t xml:space="preserve">Why it’s needed</w:t>
-      </w:r>
-      <w:r>
-        <w:t xml:space="preserve">: To coordinate cross-platform actions. When a lead is ingested or changes stages, the Express server fires a webhook payload containing the lead profile to n8n.</w:t>
-      </w:r>
-    </w:p>
-    <w:p>
-      <w:pPr>
-        <w:numPr>
-          <w:ilvl w:val="0"/>
-          <w:numId w:val="1008"/>
-        </w:numPr>
-        <w:pStyle w:val="Compact"/>
-      </w:pPr>
-      <w:r>
-        <w:rPr>
-          <w:bCs/>
-          <w:b/>
-        </w:rPr>
-        <w:t xml:space="preserve">How it fits</w:t>
-      </w:r>
-      <w:r>
-        <w:t xml:space="preserve">: n8n intercepts the webhook and syncs the records to other tools (e.g., Google Sheets, Slack alerts, or Salesforce).</w:t>
-      </w:r>
-    </w:p>
-    <w:p>
-      <w:pPr>
-        <w:numPr>
-          <w:ilvl w:val="0"/>
-          <w:numId w:val="1008"/>
-        </w:numPr>
-        <w:pStyle w:val="Compact"/>
-      </w:pPr>
-      <w:r>
-        <w:rPr>
-          <w:bCs/>
-          <w:b/>
-        </w:rPr>
-        <w:t xml:space="preserve">Current Sandbox Status</w:t>
-      </w:r>
-      <w:r>
-        <w:t xml:space="preserve">: By default, the application runs in a self-contained testing mode. The server points</w:t>
-      </w:r>
-      <w:r>
-        <w:t xml:space="preserve"> </w:t>
-      </w:r>
-      <w:r>
-        <w:rPr>
-          <w:rStyle w:val="VerbatimChar"/>
-        </w:rPr>
-        <w:t xml:space="preserve">N8N_WEBHOOK_URL</w:t>
-      </w:r>
-      <w:r>
-        <w:t xml:space="preserve"> </w:t>
-      </w:r>
-      <w:r>
-        <w:t xml:space="preserve">to its own internal endpoint</w:t>
-      </w:r>
-      <w:r>
-        <w:t xml:space="preserve"> </w:t>
-      </w:r>
-      <w:r>
-        <w:rPr>
-          <w:rStyle w:val="VerbatimChar"/>
-        </w:rPr>
-        <w:t xml:space="preserve">POST /api/v1/leads/mock-n8n-receiver</w:t>
-      </w:r>
-      <w:r>
-        <w:t xml:space="preserve">. When a lead is added, the server successfully triggers an outbound network request to itself, printing the formatted payload in the logs to verify payload formatting.</w:t>
-      </w:r>
-    </w:p>
-    <w:p>
-      <w:pPr>
-        <w:numPr>
-          <w:ilvl w:val="0"/>
-          <w:numId w:val="1008"/>
-        </w:numPr>
-        <w:pStyle w:val="Compact"/>
-      </w:pPr>
-      <w:r>
-        <w:rPr>
-          <w:bCs/>
-          <w:b/>
-        </w:rPr>
-        <w:t xml:space="preserve">Production Setup</w:t>
-      </w:r>
-      <w:r>
-        <w:t xml:space="preserve">: To connect to a live n8n instance:</w:t>
-      </w:r>
-    </w:p>
-    <w:p>
-      <w:pPr>
-        <w:numPr>
-          <w:ilvl w:val="1"/>
           <w:numId w:val="1009"/>
         </w:numPr>
         <w:pStyle w:val="Compact"/>
       </w:pPr>
       <w:r>
-        <w:t xml:space="preserve">Create a workflow in n8n starting with a</w:t>
-      </w:r>
-      <w:r>
-        <w:t xml:space="preserve"> </w:t>
-      </w:r>
-      <w:r>
-        <w:rPr>
-          <w:bCs/>
-          <w:b/>
-        </w:rPr>
-        <w:t xml:space="preserve">Webhook</w:t>
-      </w:r>
-      <w:r>
-        <w:t xml:space="preserve"> </w:t>
-      </w:r>
-      <w:r>
-        <w:t xml:space="preserve">node set to</w:t>
-      </w:r>
-      <w:r>
-        <w:t xml:space="preserve"> </w:t>
-      </w:r>
-      <w:r>
-        <w:rPr>
-          <w:rStyle w:val="VerbatimChar"/>
-        </w:rPr>
-        <w:t xml:space="preserve">POST</w:t>
-      </w:r>
-      <w:r>
-        <w:t xml:space="preserve">.</w:t>
+        <w:rPr>
+          <w:bCs/>
+          <w:b/>
+        </w:rPr>
+        <w:t xml:space="preserve">Why it’s needed</w:t>
+      </w:r>
+      <w:r>
+        <w:t xml:space="preserve">: To coordinate cross-platform actions. When a lead is ingested or changes stages, the Express server fires a webhook payload containing the lead profile to n8n.</w:t>
       </w:r>
     </w:p>
     <w:p>
       <w:pPr>
         <w:numPr>
-          <w:ilvl w:val="1"/>
+          <w:ilvl w:val="0"/>
           <w:numId w:val="1009"/>
         </w:numPr>
         <w:pStyle w:val="Compact"/>
       </w:pPr>
       <w:r>
-        <w:t xml:space="preserve">Copy the webhook URL (e.g.,</w:t>
-      </w:r>
-      <w:r>
-        <w:t xml:space="preserve"> </w:t>
-      </w:r>
-      <w:r>
-        <w:rPr>
-          <w:rStyle w:val="VerbatimChar"/>
-        </w:rPr>
-        <w:t xml:space="preserve">https://n8n.yourdomain.com/webhook/abc-123</w:t>
-      </w:r>
-      <w:r>
-        <w:t xml:space="preserve">).</w:t>
+        <w:rPr>
+          <w:bCs/>
+          <w:b/>
+        </w:rPr>
+        <w:t xml:space="preserve">How it fits</w:t>
+      </w:r>
+      <w:r>
+        <w:t xml:space="preserve">: n8n intercepts the webhook and syncs the records to other tools (e.g., Google Sheets, Slack alerts, or Salesforce).</w:t>
       </w:r>
     </w:p>
     <w:p>
       <w:pPr>
         <w:numPr>
-          <w:ilvl w:val="1"/>
+          <w:ilvl w:val="0"/>
           <w:numId w:val="1009"/>
         </w:numPr>
         <w:pStyle w:val="Compact"/>
       </w:pPr>
       <w:r>
-        <w:t xml:space="preserve">Define</w:t>
+        <w:rPr>
+          <w:bCs/>
+          <w:b/>
+        </w:rPr>
+        <w:t xml:space="preserve">Current Sandbox Status</w:t>
+      </w:r>
+      <w:r>
+        <w:t xml:space="preserve">: By default, the application runs in a self-contained testing mode. The server points</w:t>
       </w:r>
       <w:r>
         <w:t xml:space="preserve"> </w:t>
@@ -2460,13 +2438,13 @@
         <w:rPr>
           <w:rStyle w:val="VerbatimChar"/>
         </w:rPr>
-        <w:t xml:space="preserve">N8N_WEBHOOK_URL="https://n8n.yourdomain.com/webhook/abc-123"</w:t>
-      </w:r>
-      <w:r>
-        <w:t xml:space="preserve"> </w:t>
-      </w:r>
-      <w:r>
-        <w:t xml:space="preserve">in your Render Environment Variables or local</w:t>
+        <w:t xml:space="preserve">N8N_WEBHOOK_URL</w:t>
+      </w:r>
+      <w:r>
+        <w:t xml:space="preserve"> </w:t>
+      </w:r>
+      <w:r>
+        <w:t xml:space="preserve">to its own internal endpoint</w:t>
       </w:r>
       <w:r>
         <w:t xml:space="preserve"> </w:t>
@@ -2475,84 +2453,206 @@
         <w:rPr>
           <w:rStyle w:val="VerbatimChar"/>
         </w:rPr>
-        <w:t xml:space="preserve">.env</w:t>
-      </w:r>
-      <w:r>
-        <w:t xml:space="preserve"> </w:t>
-      </w:r>
-      <w:r>
-        <w:t xml:space="preserve">file.</w:t>
+        <w:t xml:space="preserve">POST /api/v1/leads/mock-n8n-receiver</w:t>
+      </w:r>
+      <w:r>
+        <w:t xml:space="preserve">. When a lead is added, the server successfully triggers an outbound network request to itself, printing the formatted payload in the logs to verify payload formatting.</w:t>
       </w:r>
     </w:p>
     <w:p>
       <w:pPr>
         <w:numPr>
-          <w:ilvl w:val="1"/>
+          <w:ilvl w:val="0"/>
           <w:numId w:val="1009"/>
         </w:numPr>
         <w:pStyle w:val="Compact"/>
       </w:pPr>
       <w:r>
-        <w:t xml:space="preserve">The engine will automatically transition from simulation mode to sending live HTTP posts to your active flow.</w:t>
-      </w:r>
-    </w:p>
-    <w:bookmarkEnd w:id="43"/>
-    <w:bookmarkStart w:id="44" w:name="twilio-sms-messaging-gateway"/>
-    <w:p>
-      <w:pPr>
-        <w:pStyle w:val="Heading4"/>
-      </w:pPr>
-      <w:r>
-        <w:t xml:space="preserve">2. Twilio (SMS &amp; Messaging Gateway)</w:t>
+        <w:rPr>
+          <w:bCs/>
+          <w:b/>
+        </w:rPr>
+        <w:t xml:space="preserve">Production Setup</w:t>
+      </w:r>
+      <w:r>
+        <w:t xml:space="preserve">: To connect to a live n8n instance:</w:t>
       </w:r>
     </w:p>
     <w:p>
       <w:pPr>
         <w:numPr>
-          <w:ilvl w:val="0"/>
+          <w:ilvl w:val="1"/>
           <w:numId w:val="1010"/>
         </w:numPr>
         <w:pStyle w:val="Compact"/>
       </w:pPr>
       <w:r>
-        <w:rPr>
-          <w:bCs/>
-          <w:b/>
-        </w:rPr>
-        <w:t xml:space="preserve">Why it’s needed</w:t>
-      </w:r>
-      <w:r>
-        <w:t xml:space="preserve">: To deliver instant customer notifications (autoresponders, scheduling confirmations, shipment tracking updates) directly to mobile phones.</w:t>
+        <w:t xml:space="preserve">Create a workflow in n8n starting with a</w:t>
+      </w:r>
+      <w:r>
+        <w:t xml:space="preserve"> </w:t>
+      </w:r>
+      <w:r>
+        <w:rPr>
+          <w:bCs/>
+          <w:b/>
+        </w:rPr>
+        <w:t xml:space="preserve">Webhook</w:t>
+      </w:r>
+      <w:r>
+        <w:t xml:space="preserve"> </w:t>
+      </w:r>
+      <w:r>
+        <w:t xml:space="preserve">node set to</w:t>
+      </w:r>
+      <w:r>
+        <w:t xml:space="preserve"> </w:t>
+      </w:r>
+      <w:r>
+        <w:rPr>
+          <w:rStyle w:val="VerbatimChar"/>
+        </w:rPr>
+        <w:t xml:space="preserve">POST</w:t>
+      </w:r>
+      <w:r>
+        <w:t xml:space="preserve">.</w:t>
       </w:r>
     </w:p>
     <w:p>
       <w:pPr>
         <w:numPr>
-          <w:ilvl w:val="0"/>
+          <w:ilvl w:val="1"/>
           <w:numId w:val="1010"/>
         </w:numPr>
         <w:pStyle w:val="Compact"/>
       </w:pPr>
       <w:r>
-        <w:rPr>
-          <w:bCs/>
-          <w:b/>
-        </w:rPr>
-        <w:t xml:space="preserve">How it fits</w:t>
-      </w:r>
-      <w:r>
-        <w:t xml:space="preserve">: The backend triggers SMS payloads containing tracking numbers and surveyor slots.</w:t>
+        <w:t xml:space="preserve">Copy the webhook URL (e.g.,</w:t>
+      </w:r>
+      <w:r>
+        <w:t xml:space="preserve"> </w:t>
+      </w:r>
+      <w:r>
+        <w:rPr>
+          <w:rStyle w:val="VerbatimChar"/>
+        </w:rPr>
+        <w:t xml:space="preserve">https://n8n.yourdomain.com/webhook/abc-123</w:t>
+      </w:r>
+      <w:r>
+        <w:t xml:space="preserve">).</w:t>
       </w:r>
     </w:p>
     <w:p>
       <w:pPr>
         <w:numPr>
-          <w:ilvl w:val="0"/>
+          <w:ilvl w:val="1"/>
           <w:numId w:val="1010"/>
         </w:numPr>
         <w:pStyle w:val="Compact"/>
       </w:pPr>
       <w:r>
+        <w:t xml:space="preserve">Define</w:t>
+      </w:r>
+      <w:r>
+        <w:t xml:space="preserve"> </w:t>
+      </w:r>
+      <w:r>
+        <w:rPr>
+          <w:rStyle w:val="VerbatimChar"/>
+        </w:rPr>
+        <w:t xml:space="preserve">N8N_WEBHOOK_URL="https://n8n.yourdomain.com/webhook/abc-123"</w:t>
+      </w:r>
+      <w:r>
+        <w:t xml:space="preserve"> </w:t>
+      </w:r>
+      <w:r>
+        <w:t xml:space="preserve">in your Render Environment Variables or local</w:t>
+      </w:r>
+      <w:r>
+        <w:t xml:space="preserve"> </w:t>
+      </w:r>
+      <w:r>
+        <w:rPr>
+          <w:rStyle w:val="VerbatimChar"/>
+        </w:rPr>
+        <w:t xml:space="preserve">.env</w:t>
+      </w:r>
+      <w:r>
+        <w:t xml:space="preserve"> </w:t>
+      </w:r>
+      <w:r>
+        <w:t xml:space="preserve">file.</w:t>
+      </w:r>
+    </w:p>
+    <w:p>
+      <w:pPr>
+        <w:numPr>
+          <w:ilvl w:val="1"/>
+          <w:numId w:val="1010"/>
+        </w:numPr>
+        <w:pStyle w:val="Compact"/>
+      </w:pPr>
+      <w:r>
+        <w:t xml:space="preserve">The engine will automatically transition from simulation mode to sending live HTTP posts to your active flow.</w:t>
+      </w:r>
+    </w:p>
+    <w:bookmarkEnd w:id="43"/>
+    <w:bookmarkStart w:id="44" w:name="twilio-sms-messaging-gateway"/>
+    <w:p>
+      <w:pPr>
+        <w:pStyle w:val="Heading4"/>
+      </w:pPr>
+      <w:r>
+        <w:t xml:space="preserve">2. Twilio (SMS &amp; Messaging Gateway)</w:t>
+      </w:r>
+    </w:p>
+    <w:p>
+      <w:pPr>
+        <w:numPr>
+          <w:ilvl w:val="0"/>
+          <w:numId w:val="1011"/>
+        </w:numPr>
+        <w:pStyle w:val="Compact"/>
+      </w:pPr>
+      <w:r>
+        <w:rPr>
+          <w:bCs/>
+          <w:b/>
+        </w:rPr>
+        <w:t xml:space="preserve">Why it’s needed</w:t>
+      </w:r>
+      <w:r>
+        <w:t xml:space="preserve">: To deliver instant customer notifications (autoresponders, scheduling confirmations, shipment tracking updates) directly to mobile phones.</w:t>
+      </w:r>
+    </w:p>
+    <w:p>
+      <w:pPr>
+        <w:numPr>
+          <w:ilvl w:val="0"/>
+          <w:numId w:val="1011"/>
+        </w:numPr>
+        <w:pStyle w:val="Compact"/>
+      </w:pPr>
+      <w:r>
+        <w:rPr>
+          <w:bCs/>
+          <w:b/>
+        </w:rPr>
+        <w:t xml:space="preserve">How it fits</w:t>
+      </w:r>
+      <w:r>
+        <w:t xml:space="preserve">: The backend triggers SMS payloads containing tracking numbers and surveyor slots.</w:t>
+      </w:r>
+    </w:p>
+    <w:p>
+      <w:pPr>
+        <w:numPr>
+          <w:ilvl w:val="0"/>
+          <w:numId w:val="1011"/>
+        </w:numPr>
+        <w:pStyle w:val="Compact"/>
+      </w:pPr>
+      <w:r>
         <w:rPr>
           <w:bCs/>
           <w:b/>
@@ -2577,12 +2677,383 @@
       </w:r>
       <w:r>
         <w:t xml:space="preserve">panel, allowing users to verify messaging triggers and copy in-flight texts without configuring credentials.</w:t>
+      </w:r>
+    </w:p>
+    <w:p>
+      <w:r>
+        <w:pict>
+          <v:rect style="width:0;height:1.5pt" o:hralign="center" o:hrstd="t" o:hr="t"/>
+        </w:pict>
       </w:r>
     </w:p>
     <w:bookmarkEnd w:id="44"/>
     <w:bookmarkEnd w:id="45"/>
+    <w:bookmarkStart w:id="49" w:name="security-failsafe-implementations"/>
+    <w:p>
+      <w:pPr>
+        <w:pStyle w:val="Heading3"/>
+      </w:pPr>
+      <w:r>
+        <w:t xml:space="preserve">7. Security &amp; Failsafe Implementations</w:t>
+      </w:r>
+    </w:p>
+    <w:p>
+      <w:pPr>
+        <w:pStyle w:val="FirstParagraph"/>
+      </w:pPr>
+      <w:r>
+        <w:t xml:space="preserve">To protect the application and ensure portfolio-grade defensive practices, three security controls are enforced:</w:t>
+      </w:r>
+    </w:p>
+    <w:bookmarkStart w:id="46" w:name="api-rate-limiting"/>
+    <w:p>
+      <w:pPr>
+        <w:pStyle w:val="Heading4"/>
+      </w:pPr>
+      <w:r>
+        <w:t xml:space="preserve">1. API Rate Limiting</w:t>
+      </w:r>
+    </w:p>
+    <w:p>
+      <w:pPr>
+        <w:pStyle w:val="FirstParagraph"/>
+      </w:pPr>
+      <w:r>
+        <w:t xml:space="preserve">The public lead ingestion endpoint (</w:t>
+      </w:r>
+      <w:r>
+        <w:rPr>
+          <w:rStyle w:val="VerbatimChar"/>
+        </w:rPr>
+        <w:t xml:space="preserve">POST /api/v1/leads/ingest</w:t>
+      </w:r>
+      <w:r>
+        <w:t xml:space="preserve">) has an active rate limiter:</w:t>
+      </w:r>
+      <w:r>
+        <w:t xml:space="preserve"> </w:t>
+      </w:r>
+      <w:r>
+        <w:t xml:space="preserve">*</w:t>
+      </w:r>
+      <w:r>
+        <w:t xml:space="preserve"> </w:t>
+      </w:r>
+      <w:r>
+        <w:rPr>
+          <w:bCs/>
+          <w:b/>
+        </w:rPr>
+        <w:t xml:space="preserve">Constraint</w:t>
+      </w:r>
+      <w:r>
+        <w:t xml:space="preserve">: Maximum of 100 requests per 15 minutes per IP address.</w:t>
+      </w:r>
+      <w:r>
+        <w:t xml:space="preserve"> </w:t>
+      </w:r>
+      <w:r>
+        <w:t xml:space="preserve">*</w:t>
+      </w:r>
+      <w:r>
+        <w:t xml:space="preserve"> </w:t>
+      </w:r>
+      <w:r>
+        <w:rPr>
+          <w:bCs/>
+          <w:b/>
+        </w:rPr>
+        <w:t xml:space="preserve">Failsafe Action</w:t>
+      </w:r>
+      <w:r>
+        <w:t xml:space="preserve">: Spammer IPs receive a</w:t>
+      </w:r>
+      <w:r>
+        <w:t xml:space="preserve"> </w:t>
+      </w:r>
+      <w:r>
+        <w:rPr>
+          <w:rStyle w:val="VerbatimChar"/>
+        </w:rPr>
+        <w:t xml:space="preserve">429 Too Many Requests</w:t>
+      </w:r>
+      <w:r>
+        <w:t xml:space="preserve"> </w:t>
+      </w:r>
+      <w:r>
+        <w:t xml:space="preserve">status, protecting the server and Supabase from database-ballooning attacks.</w:t>
+      </w:r>
+    </w:p>
     <w:bookmarkEnd w:id="46"/>
+    <w:bookmarkStart w:id="47" w:name="global-xss-shield-input-sanitization"/>
+    <w:p>
+      <w:pPr>
+        <w:pStyle w:val="Heading4"/>
+      </w:pPr>
+      <w:r>
+        <w:t xml:space="preserve">2. Global XSS Shield (Input Sanitization)</w:t>
+      </w:r>
+    </w:p>
+    <w:p>
+      <w:pPr>
+        <w:pStyle w:val="FirstParagraph"/>
+      </w:pPr>
+      <w:r>
+        <w:t xml:space="preserve">To prevent Cross-Site Scripting (XSS) attacks in the dashboard console:</w:t>
+      </w:r>
+      <w:r>
+        <w:t xml:space="preserve"> </w:t>
+      </w:r>
+      <w:r>
+        <w:t xml:space="preserve">*</w:t>
+      </w:r>
+      <w:r>
+        <w:t xml:space="preserve"> </w:t>
+      </w:r>
+      <w:r>
+        <w:rPr>
+          <w:bCs/>
+          <w:b/>
+        </w:rPr>
+        <w:t xml:space="preserve">Action</w:t>
+      </w:r>
+      <w:r>
+        <w:t xml:space="preserve">: Every incoming JSON request body is scanned recursively by Express middleware.</w:t>
+      </w:r>
+      <w:r>
+        <w:t xml:space="preserve"> </w:t>
+      </w:r>
+      <w:r>
+        <w:t xml:space="preserve">*</w:t>
+      </w:r>
+      <w:r>
+        <w:t xml:space="preserve"> </w:t>
+      </w:r>
+      <w:r>
+        <w:rPr>
+          <w:bCs/>
+          <w:b/>
+        </w:rPr>
+        <w:t xml:space="preserve">Failsafe Action</w:t>
+      </w:r>
+      <w:r>
+        <w:t xml:space="preserve">: Any HTML/Script tags (e.g. </w:t>
+      </w:r>
+      <w:r>
+        <w:rPr>
+          <w:rStyle w:val="VerbatimChar"/>
+        </w:rPr>
+        <w:t xml:space="preserve">&lt;script&gt;</w:t>
+      </w:r>
+      <w:r>
+        <w:t xml:space="preserve">,</w:t>
+      </w:r>
+      <w:r>
+        <w:t xml:space="preserve"> </w:t>
+      </w:r>
+      <w:r>
+        <w:rPr>
+          <w:rStyle w:val="VerbatimChar"/>
+        </w:rPr>
+        <w:t xml:space="preserve">&lt;iframe&gt;</w:t>
+      </w:r>
+      <w:r>
+        <w:t xml:space="preserve">) are stripped automatically before saving records.</w:t>
+      </w:r>
+    </w:p>
     <w:bookmarkEnd w:id="47"/>
+    <w:bookmarkStart w:id="48" w:name="Xa461572be5d859a051eff4ae0776cbc24bce48f"/>
+    <w:p>
+      <w:pPr>
+        <w:pStyle w:val="Heading4"/>
+      </w:pPr>
+      <w:r>
+        <w:t xml:space="preserve">3. Environment-Driven API Token Authorization</w:t>
+      </w:r>
+    </w:p>
+    <w:p>
+      <w:pPr>
+        <w:pStyle w:val="FirstParagraph"/>
+      </w:pPr>
+      <w:r>
+        <w:t xml:space="preserve">Modifying endpoints (like</w:t>
+      </w:r>
+      <w:r>
+        <w:t xml:space="preserve"> </w:t>
+      </w:r>
+      <w:r>
+        <w:rPr>
+          <w:rStyle w:val="VerbatimChar"/>
+        </w:rPr>
+        <w:t xml:space="preserve">PATCH</w:t>
+      </w:r>
+      <w:r>
+        <w:t xml:space="preserve"> </w:t>
+      </w:r>
+      <w:r>
+        <w:t xml:space="preserve">lead updates,</w:t>
+      </w:r>
+      <w:r>
+        <w:t xml:space="preserve"> </w:t>
+      </w:r>
+      <w:r>
+        <w:rPr>
+          <w:rStyle w:val="VerbatimChar"/>
+        </w:rPr>
+        <w:t xml:space="preserve">DELETE</w:t>
+      </w:r>
+      <w:r>
+        <w:t xml:space="preserve"> </w:t>
+      </w:r>
+      <w:r>
+        <w:t xml:space="preserve">inventory items, and shipping logistics requests) are protected by Bearer Token validation:</w:t>
+      </w:r>
+      <w:r>
+        <w:t xml:space="preserve"> </w:t>
+      </w:r>
+      <w:r>
+        <w:t xml:space="preserve">*</w:t>
+      </w:r>
+      <w:r>
+        <w:t xml:space="preserve"> </w:t>
+      </w:r>
+      <w:r>
+        <w:rPr>
+          <w:bCs/>
+          <w:b/>
+        </w:rPr>
+        <w:t xml:space="preserve">Authorization Headers</w:t>
+      </w:r>
+      <w:r>
+        <w:t xml:space="preserve">: Binds</w:t>
+      </w:r>
+      <w:r>
+        <w:t xml:space="preserve"> </w:t>
+      </w:r>
+      <w:r>
+        <w:rPr>
+          <w:rStyle w:val="VerbatimChar"/>
+        </w:rPr>
+        <w:t xml:space="preserve">Authorization: Bearer &lt;secret&gt;</w:t>
+      </w:r>
+      <w:r>
+        <w:t xml:space="preserve"> </w:t>
+      </w:r>
+      <w:r>
+        <w:t xml:space="preserve">or</w:t>
+      </w:r>
+      <w:r>
+        <w:t xml:space="preserve"> </w:t>
+      </w:r>
+      <w:r>
+        <w:rPr>
+          <w:rStyle w:val="VerbatimChar"/>
+        </w:rPr>
+        <w:t xml:space="preserve">X-API-KEY</w:t>
+      </w:r>
+      <w:r>
+        <w:t xml:space="preserve">.</w:t>
+      </w:r>
+      <w:r>
+        <w:t xml:space="preserve"> </w:t>
+      </w:r>
+      <w:r>
+        <w:t xml:space="preserve">*</w:t>
+      </w:r>
+      <w:r>
+        <w:t xml:space="preserve"> </w:t>
+      </w:r>
+      <w:r>
+        <w:rPr>
+          <w:bCs/>
+          <w:b/>
+        </w:rPr>
+        <w:t xml:space="preserve">Flexible Sandbox Mode</w:t>
+      </w:r>
+      <w:r>
+        <w:t xml:space="preserve">: If</w:t>
+      </w:r>
+      <w:r>
+        <w:t xml:space="preserve"> </w:t>
+      </w:r>
+      <w:r>
+        <w:rPr>
+          <w:rStyle w:val="VerbatimChar"/>
+        </w:rPr>
+        <w:t xml:space="preserve">API_SECRET_TOKEN</w:t>
+      </w:r>
+      <w:r>
+        <w:t xml:space="preserve"> </w:t>
+      </w:r>
+      <w:r>
+        <w:t xml:space="preserve">is not defined in the server’s environment variables, the auth check is bypassed automatically.</w:t>
+      </w:r>
+      <w:r>
+        <w:t xml:space="preserve"> </w:t>
+      </w:r>
+      <w:r>
+        <w:t xml:space="preserve">*</w:t>
+      </w:r>
+      <w:r>
+        <w:t xml:space="preserve"> </w:t>
+      </w:r>
+      <w:r>
+        <w:rPr>
+          <w:bCs/>
+          <w:b/>
+        </w:rPr>
+        <w:t xml:space="preserve">Production Lock-Down</w:t>
+      </w:r>
+      <w:r>
+        <w:t xml:space="preserve">: Defining</w:t>
+      </w:r>
+      <w:r>
+        <w:t xml:space="preserve"> </w:t>
+      </w:r>
+      <w:r>
+        <w:rPr>
+          <w:rStyle w:val="VerbatimChar"/>
+        </w:rPr>
+        <w:t xml:space="preserve">API_SECRET_TOKEN</w:t>
+      </w:r>
+      <w:r>
+        <w:t xml:space="preserve"> </w:t>
+      </w:r>
+      <w:r>
+        <w:t xml:space="preserve">(on Render or</w:t>
+      </w:r>
+      <w:r>
+        <w:t xml:space="preserve"> </w:t>
+      </w:r>
+      <w:r>
+        <w:rPr>
+          <w:rStyle w:val="VerbatimChar"/>
+        </w:rPr>
+        <w:t xml:space="preserve">.env</w:t>
+      </w:r>
+      <w:r>
+        <w:t xml:space="preserve">) instantly blocks unauthorized client-side edits with a</w:t>
+      </w:r>
+      <w:r>
+        <w:t xml:space="preserve"> </w:t>
+      </w:r>
+      <w:r>
+        <w:rPr>
+          <w:rStyle w:val="VerbatimChar"/>
+        </w:rPr>
+        <w:t xml:space="preserve">401 Unauthorized</w:t>
+      </w:r>
+      <w:r>
+        <w:t xml:space="preserve"> </w:t>
+      </w:r>
+      <w:r>
+        <w:t xml:space="preserve">response.</w:t>
+      </w:r>
+    </w:p>
+    <w:bookmarkEnd w:id="48"/>
+    <w:bookmarkEnd w:id="49"/>
+    <w:bookmarkEnd w:id="50"/>
+    <w:bookmarkEnd w:id="51"/>
     <w:sectPr/>
   </w:body>
 </w:document>
@@ -2860,6 +3331,9 @@
     <w:abstractNumId w:val="991"/>
   </w:num>
   <w:num w:numId="1003">
+    <w:abstractNumId w:val="991"/>
+  </w:num>
+  <w:num w:numId="1004">
     <w:abstractNumId w:val="99411"/>
     <w:lvlOverride w:ilvl="0">
       <w:startOverride w:val="1"/>
@@ -2889,38 +3363,8 @@
       <w:startOverride w:val="1"/>
     </w:lvlOverride>
   </w:num>
-  <w:num w:numId="1004">
+  <w:num w:numId="1005">
     <w:abstractNumId w:val="991"/>
-  </w:num>
-  <w:num w:numId="1005">
-    <w:abstractNumId w:val="99411"/>
-    <w:lvlOverride w:ilvl="0">
-      <w:startOverride w:val="1"/>
-    </w:lvlOverride>
-    <w:lvlOverride w:ilvl="1">
-      <w:startOverride w:val="1"/>
-    </w:lvlOverride>
-    <w:lvlOverride w:ilvl="2">
-      <w:startOverride w:val="1"/>
-    </w:lvlOverride>
-    <w:lvlOverride w:ilvl="3">
-      <w:startOverride w:val="1"/>
-    </w:lvlOverride>
-    <w:lvlOverride w:ilvl="4">
-      <w:startOverride w:val="1"/>
-    </w:lvlOverride>
-    <w:lvlOverride w:ilvl="5">
-      <w:startOverride w:val="1"/>
-    </w:lvlOverride>
-    <w:lvlOverride w:ilvl="6">
-      <w:startOverride w:val="1"/>
-    </w:lvlOverride>
-    <w:lvlOverride w:ilvl="7">
-      <w:startOverride w:val="1"/>
-    </w:lvlOverride>
-    <w:lvlOverride w:ilvl="8">
-      <w:startOverride w:val="1"/>
-    </w:lvlOverride>
   </w:num>
   <w:num w:numId="1006">
     <w:abstractNumId w:val="99411"/>
@@ -2953,12 +3397,6 @@
     </w:lvlOverride>
   </w:num>
   <w:num w:numId="1007">
-    <w:abstractNumId w:val="991"/>
-  </w:num>
-  <w:num w:numId="1008">
-    <w:abstractNumId w:val="991"/>
-  </w:num>
-  <w:num w:numId="1009">
     <w:abstractNumId w:val="99411"/>
     <w:lvlOverride w:ilvl="0">
       <w:startOverride w:val="1"/>
@@ -2988,7 +3426,43 @@
       <w:startOverride w:val="1"/>
     </w:lvlOverride>
   </w:num>
+  <w:num w:numId="1008">
+    <w:abstractNumId w:val="991"/>
+  </w:num>
+  <w:num w:numId="1009">
+    <w:abstractNumId w:val="991"/>
+  </w:num>
   <w:num w:numId="1010">
+    <w:abstractNumId w:val="99411"/>
+    <w:lvlOverride w:ilvl="0">
+      <w:startOverride w:val="1"/>
+    </w:lvlOverride>
+    <w:lvlOverride w:ilvl="1">
+      <w:startOverride w:val="1"/>
+    </w:lvlOverride>
+    <w:lvlOverride w:ilvl="2">
+      <w:startOverride w:val="1"/>
+    </w:lvlOverride>
+    <w:lvlOverride w:ilvl="3">
+      <w:startOverride w:val="1"/>
+    </w:lvlOverride>
+    <w:lvlOverride w:ilvl="4">
+      <w:startOverride w:val="1"/>
+    </w:lvlOverride>
+    <w:lvlOverride w:ilvl="5">
+      <w:startOverride w:val="1"/>
+    </w:lvlOverride>
+    <w:lvlOverride w:ilvl="6">
+      <w:startOverride w:val="1"/>
+    </w:lvlOverride>
+    <w:lvlOverride w:ilvl="7">
+      <w:startOverride w:val="1"/>
+    </w:lvlOverride>
+    <w:lvlOverride w:ilvl="8">
+      <w:startOverride w:val="1"/>
+    </w:lvlOverride>
+  </w:num>
+  <w:num w:numId="1011">
     <w:abstractNumId w:val="991"/>
   </w:num>
 </w:numbering>

</xml_diff>